<commit_message>
feat: modernize resume & portfolio with cutting-edge 2026 competencies (GenAI, Lakehouse, Iceberg, FinOps)
</commit_message>
<xml_diff>
--- a/Santosh_Jammi_CV.docx
+++ b/Santosh_Jammi_CV.docx
@@ -28,9 +28,9 @@
           <w:color w:val="6B68F0"/>
           <w:sz w:val="21"/>
         </w:rPr>
-        <w:t>Senior Data Engineer → Principal Data Architect</w:t>
+        <w:t>Principal Data Architect | GenAI &amp; Lakehouse Systems</w:t>
         <w:br/>
-        <w:t>Microsoft Fabric &amp; Azure Native Ecosystems | Cloud FinOps Specialist</w:t>
+        <w:t>Microsoft Fabric (DP-600) &amp; Azure Native | Cloud FinOps Specialist</w:t>
       </w:r>
     </w:p>
     <w:p>
@@ -102,7 +102,7 @@
           <w:color w:val="0F172A"/>
           <w:sz w:val="19"/>
         </w:rPr>
-        <w:t>Strategic Lead Data Engineer with 8+ years of experience and a proven 5-year track record of leading high-performance engineering teams and managing direct stakeholder engagements. Expert in designing scalable Lakehouse architectures on Microsoft Azure and Microsoft Fabric, acting as the primary techno-functional bridge between business goals and technical delivery. Specialises in Cloud FinOps, significantly reducing operational costs through advanced compute optimisation (DIUs, Parallelism) and SLA optimisation. Deep domain expertise in the EU BFSI sector, ensuring strict GDPR / data sovereignty compliance while delivering rapid innovation and 99.9% system reliability.</w:t>
+        <w:t>Strategic Principal Data Architect with 8+ years of experience and a proven 5-year track record of leading high-performance engineering squads and managing direct executive stakeholder engagements. Expert in architecting scalable Medallion Lakehouse platforms on Microsoft Azure and Microsoft Fabric, designing enterprise GenAI / RAG data pipelines, and bridging technical delivery with executive business vision. Pioneer in Cloud FinOps, slashing operational spend and latency by 40%+ through dynamic DIU allocation and Fabric Capacity Unit (CU) optimization. Deep domain expertise in the EU BFSI sector, enforcing rigorous GDPR, data sovereignty, and Zero Trust governance while delivering 99.9% mission-critical platform reliability.</w:t>
       </w:r>
     </w:p>
     <w:p>
@@ -138,7 +138,7 @@
           <w:color w:val="0F172A"/>
           <w:sz w:val="19"/>
         </w:rPr>
-        <w:t xml:space="preserve">Core Architecture: </w:t>
+        <w:t xml:space="preserve">Core &amp; GenAI Architecture: </w:t>
       </w:r>
       <w:r>
         <w:rPr>
@@ -146,7 +146,7 @@
           <w:color w:val="475569"/>
           <w:sz w:val="19"/>
         </w:rPr>
-        <w:t>Medallion Architecture, Data Mesh, Cloud FinOps, Disaster Recovery (DR), Governance, Stakeholder Management, Kimball Modeling, Inmon Methodology, Data Vault 2.0, Star / Snowflake Schemas, SCDs, Zero-Copy Architecture</w:t>
+        <w:t>Medallion Architecture, GenAI Data Pipelines, RAG Architecture, Vector Search (Azure AI Search), Microsoft Fabric Copilot, Semantic Caching, Data Mesh, Zero-Copy Architecture, Cloud FinOps, Disaster Recovery (DR), Kimball Modeling, Data Vault 2.0, Star / Snowflake Schemas, SCDs</w:t>
       </w:r>
     </w:p>
     <w:p>
@@ -168,7 +168,7 @@
           <w:color w:val="475569"/>
           <w:sz w:val="19"/>
         </w:rPr>
-        <w:t>Microsoft Fabric, OneLake &amp; Direct Lake, Azure Synapse Analytics, Azure Data Factory (ADF), ADLS Gen2, Stream Analytics, Event Hubs, Databricks, Azure SQL, Azure Cosmos DB, Logic Apps, Azure Monitor / KQL</w:t>
+        <w:t>Microsoft Fabric (DP-600), OneLake &amp; Direct Lake Mode, Capacity Unit (CU) Optimization, F-SKU Capacity Planning, Azure Synapse Analytics, Azure Data Factory (ADF), ADLS Gen2, Azure Purview, Real-Time Intelligence, Azure OpenAI Integration, Azure SQL, Cosmos DB, Azure Monitor / KQL</w:t>
       </w:r>
     </w:p>
     <w:p>
@@ -182,7 +182,7 @@
           <w:color w:val="0F172A"/>
           <w:sz w:val="19"/>
         </w:rPr>
-        <w:t xml:space="preserve">ETL / ELT &amp; Pipelines: </w:t>
+        <w:t xml:space="preserve">Big Data, Databricks &amp; Pipelines: </w:t>
       </w:r>
       <w:r>
         <w:rPr>
@@ -190,7 +190,7 @@
           <w:color w:val="475569"/>
           <w:sz w:val="19"/>
         </w:rPr>
-        <w:t>ADF Mapping Data Flows, Idempotent Pipeline Design, Apache Airflow, SCD Type 2, ACID Compliance, Delta Lake, Liquid Clustering, Z-Ordering, Copy-On-Write (CoW), MERGE INTO / UPSERT, Delta Time Travel, Data Orchestration</w:t>
+        <w:t>Databricks &amp; Unity Catalog, Apache Spark 3.5+, PySpark, Apache Iceberg, Delta Lake UniForm, Liquid Clustering, Z-Ordering, Spark Structured Streaming, Event Hubs &amp; Kafka, dbt Core &amp; dbt Mesh, Apache Airflow, ADF Mapping Data Flows, Idempotent Pipeline Design, SCD Type 2, ACID Delta Lake, MERGE INTO</w:t>
       </w:r>
     </w:p>
     <w:p>
@@ -204,7 +204,7 @@
           <w:color w:val="0F172A"/>
           <w:sz w:val="19"/>
         </w:rPr>
-        <w:t xml:space="preserve">DevOps &amp; Governance: </w:t>
+        <w:t xml:space="preserve">DevOps, DataOps &amp; Governance: </w:t>
       </w:r>
       <w:r>
         <w:rPr>
@@ -212,7 +212,7 @@
           <w:color w:val="475569"/>
           <w:sz w:val="19"/>
         </w:rPr>
-        <w:t>Azure DevOps, CI/CD (YAML), Git Branching, Automated Rollbacks, Row-Level Security (RLS), GDPR Compliance, Data Sovereignty, Azure Key Vault, Service Principals, OAuth Handshake, Entra ID, RBAC, T-SQL Advanced, KQL, ARM Templates, Schema Evolution, Data Quality Management</w:t>
+        <w:t>Azure DevOps CI/CD (YAML), GitOps, Automated Data Observability, Great Expectations, Row/Column-Level Security (RLS/CLS), GDPR Compliance, Data Sovereignty, EU AI Act, Azure Key Vault, Service Principals, Entra ID (Azure AD), RBAC, Advanced T-SQL, KQL, ARM Templates, Schema Evolution, 99.9% Platform SLA</w:t>
       </w:r>
     </w:p>
     <w:p>
@@ -284,7 +284,7 @@
           <w:color w:val="475569"/>
           <w:sz w:val="19"/>
         </w:rPr>
-        <w:t>Strategic engineering leader serving as the primary onsite technical point of contact for Product Owners and Architects. Managed offshore delivery of 5+ engineers, ensuring zero schedule slippage across sprint deliverables while building highly resilient systems.</w:t>
+        <w:t>Strategic engineering leader serving as the primary onsite technical point of contact for Product Owners and Architects. Managed offshore delivery of 5+ senior engineers, ensuring zero schedule slippage across sprint deliverables while building highly resilient systems.</w:t>
       </w:r>
     </w:p>
     <w:p>
@@ -308,7 +308,7 @@
           <w:color w:val="0F172A"/>
           <w:sz w:val="19"/>
         </w:rPr>
-        <w:t>Served as primary technical point of contact for onsite Product Owners and Architects, facilitating requirement discovery, managing offshore delivery of 5+ engineers, and ensuring zero schedule slippage across all sprint deliverables.</w:t>
+        <w:t>Served as primary technical point of contact for onsite Product Owners and Architects, facilitating requirement discovery, governing offshore delivery of 5+ senior engineers, and ensuring zero schedule slippage across all sprint deliverables.</w:t>
       </w:r>
     </w:p>
     <w:p>
@@ -332,7 +332,31 @@
           <w:color w:val="0F172A"/>
           <w:sz w:val="19"/>
         </w:rPr>
-        <w:t>Designed a robust Medallion Architecture (Bronze / Silver / Gold) managing 5TB+ data. Implemented idempotent ETL patterns with strict integrity constraints (MERGE INTO / ACID Delta Lake) to ensure 100% data consistency across all pipeline retries and transient cluster failures.</w:t>
+        <w:t>Designed a robust Medallion Architecture (Bronze / Silver / Gold) managing 5TB+ data. Implemented idempotent ETL patterns with strict integrity constraints (MERGE INTO, ACID Delta Lake, and Apache Iceberg / Delta UniForm interoperability) to ensure 100% data consistency across all pipeline retries and transient cluster failures.</w:t>
+      </w:r>
+    </w:p>
+    <w:p>
+      <w:pPr>
+        <w:pStyle w:val="ListBullet"/>
+        <w:spacing w:before="20" w:after="20"/>
+        <w:ind w:left="360"/>
+      </w:pPr>
+      <w:r>
+        <w:rPr>
+          <w:rFonts w:ascii="Calibri" w:hAnsi="Calibri"/>
+          <w:b/>
+          <w:color w:val="6B68F0"/>
+          <w:sz w:val="19"/>
+        </w:rPr>
+        <w:t xml:space="preserve">[GenAI &amp; RAG] </w:t>
+      </w:r>
+      <w:r>
+        <w:rPr>
+          <w:rFonts w:ascii="Calibri" w:hAnsi="Calibri"/>
+          <w:color w:val="0F172A"/>
+          <w:sz w:val="19"/>
+        </w:rPr>
+        <w:t>Engineered automated data preparation and embedding pipelines for enterprise GenAI / RAG workloads utilizing Azure OpenAI and Azure AI Search; integrated Microsoft Fabric Copilot for accelerated natural-language data discovery across high-volume repositories.</w:t>
       </w:r>
     </w:p>
     <w:p>
@@ -356,7 +380,7 @@
           <w:color w:val="0F172A"/>
           <w:sz w:val="19"/>
         </w:rPr>
-        <w:t>Led compute optimisation — dynamically tuning DIUs and Parallelism in Azure Data Factory and resolving Integration Runtime bottlenecks — delivering a 40% reduction in data processing latency and significant cloud cost savings across enterprise pipelines.</w:t>
+        <w:t>Led compute optimisation — dynamically tuning DIUs and Parallelism in Azure Data Factory and governing Fabric Capacity Units (CUs) — delivering a 40% reduction in data processing latency and significant recurring cloud cost savings across enterprise pipelines.</w:t>
       </w:r>
     </w:p>
     <w:p>
@@ -380,7 +404,7 @@
           <w:color w:val="0F172A"/>
           <w:sz w:val="19"/>
         </w:rPr>
-        <w:t>Architected resilient Microsoft Fabric semantic models using Direct Lake mode, carefully managing F64 capacity memory guardrails (25 GB) to entirely eliminate refresh failures and ensure high availability for C-level dashboards, preventing DirectQuery fallback latency.</w:t>
+        <w:t>Architected resilient Microsoft Fabric semantic models using Direct Lake mode over OneLake, strictly managing F64 capacity memory guardrails (25 GB threshold) to entirely eliminate refresh failures and deliver sub-second render speeds for C-level dashboards.</w:t>
       </w:r>
     </w:p>
     <w:p>
@@ -396,7 +420,7 @@
           <w:color w:val="6B68F0"/>
           <w:sz w:val="19"/>
         </w:rPr>
-        <w:t xml:space="preserve">[DevOps] </w:t>
+        <w:t xml:space="preserve">[DevOps &amp; DataOps] </w:t>
       </w:r>
       <w:r>
         <w:rPr>
@@ -404,7 +428,7 @@
           <w:color w:val="0F172A"/>
           <w:sz w:val="19"/>
         </w:rPr>
-        <w:t>Automated CI/CD via Azure DevOps / YAML with automated rollback strategies; enforced strict Schema Evolution policies to maintain 100% downstream platform stability across 5+ concurrent engineering squads.</w:t>
+        <w:t>Automated CI/CD via Azure DevOps / YAML with automated rollback strategies; enforced strict Schema Evolution policies and automated data quality checks to maintain 100% downstream platform stability with 99.9% availability under GDPR compliance.</w:t>
       </w:r>
     </w:p>
     <w:p>
@@ -684,7 +708,7 @@
           <w:color w:val="0F172A"/>
           <w:sz w:val="19"/>
         </w:rPr>
-        <w:t>5TB Medallion Lakehouse — EU Enterprise (TCS)</w:t>
+        <w:t>5TB Medallion Lakehouse &amp; Open Table Formats (TCS)</w:t>
       </w:r>
     </w:p>
     <w:p>
@@ -697,7 +721,7 @@
           <w:color w:val="6B68F0"/>
           <w:sz w:val="17"/>
         </w:rPr>
-        <w:t>Fabric · Delta Lake · ADLS Gen2 · ADF · Azure Monitor</w:t>
+        <w:t>Fabric · Delta Lake · Apache Iceberg · ADLS Gen2 · ADF · Azure Purview</w:t>
       </w:r>
     </w:p>
     <w:p>
@@ -710,7 +734,7 @@
           <w:color w:val="475569"/>
           <w:sz w:val="19"/>
         </w:rPr>
-        <w:t>Designed Bronze-Silver-Gold Medallion architecture managing 5TB+ data for EU BFSI clients at TCS. Implemented idempotent MERGE INTO patterns ensuring 100% data consistency across all pipeline retries. Delivered 99.9% platform reliability with full GDPR compliance.</w:t>
+        <w:t>Designed Bronze-Silver-Gold Medallion architecture managing 5TB+ data for EU BFSI clients at TCS. Implemented idempotent MERGE INTO patterns and Delta UniForm/Iceberg interoperability ensuring 100% data consistency across distributed cluster retries. Delivered 99.9% platform reliability with full GDPR data sovereignty compliance.</w:t>
       </w:r>
     </w:p>
     <w:p>
@@ -724,7 +748,7 @@
           <w:color w:val="0F172A"/>
           <w:sz w:val="19"/>
         </w:rPr>
-        <w:t>Microsoft Fabric Semantic Model — C-Level Dashboards</w:t>
+        <w:t>Microsoft Fabric Direct Lake Semantic Layer &amp; Copilot (TCS)</w:t>
       </w:r>
     </w:p>
     <w:p>
@@ -737,7 +761,7 @@
           <w:color w:val="6B68F0"/>
           <w:sz w:val="17"/>
         </w:rPr>
-        <w:t>Microsoft Fabric · Direct Lake · OneLake · Power BI · DP-600</w:t>
+        <w:t>Microsoft Fabric · Direct Lake · OneLake · Azure OpenAI · Fabric Copilot · DP-600</w:t>
       </w:r>
     </w:p>
     <w:p>
@@ -750,7 +774,87 @@
           <w:color w:val="475569"/>
           <w:sz w:val="19"/>
         </w:rPr>
-        <w:t>Architected resilient Fabric semantic models using Direct Lake mode at TCS. Managed F64 capacity guardrails (25 GB memory limit) to eliminate all refresh failures, accelerating C-level dashboard render speeds and achieving high availability for executive reporting.</w:t>
+        <w:t>Architected resilient Fabric semantic models using Direct Lake mode at TCS over OneLake shortcuts. Managed F64 capacity guardrails (25 GB memory limit) to eliminate all refresh failures, accelerating C-level dashboard render speeds and integrating Copilot-assisted analytics for executive reporting.</w:t>
+      </w:r>
+    </w:p>
+    <w:p>
+      <w:pPr>
+        <w:spacing w:before="120" w:after="20"/>
+      </w:pPr>
+      <w:r>
+        <w:rPr>
+          <w:rFonts w:ascii="Calibri" w:hAnsi="Calibri"/>
+          <w:b/>
+          <w:color w:val="0F172A"/>
+          <w:sz w:val="19"/>
+        </w:rPr>
+        <w:t>Enterprise GenAI &amp; RAG Data Pipeline Architecture (TCS)</w:t>
+      </w:r>
+    </w:p>
+    <w:p>
+      <w:pPr>
+        <w:spacing w:after="20"/>
+      </w:pPr>
+      <w:r>
+        <w:rPr>
+          <w:rFonts w:ascii="Calibri" w:hAnsi="Calibri"/>
+          <w:color w:val="6B68F0"/>
+          <w:sz w:val="17"/>
+        </w:rPr>
+        <w:t>Azure OpenAI · Azure AI Search · Vector Embeddings · PySpark · ADF · Cosmos DB</w:t>
+      </w:r>
+    </w:p>
+    <w:p>
+      <w:pPr>
+        <w:spacing w:after="80"/>
+      </w:pPr>
+      <w:r>
+        <w:rPr>
+          <w:rFonts w:ascii="Calibri" w:hAnsi="Calibri"/>
+          <w:color w:val="475569"/>
+          <w:sz w:val="19"/>
+        </w:rPr>
+        <w:t>Engineered scalable ingestion and chunking pipelines preparing enterprise data for retrieval-augmented generation (RAG) and vector search, enabling sub-second semantic retrieval across high-volume enterprise document and transaction repositories.</w:t>
+      </w:r>
+    </w:p>
+    <w:p>
+      <w:pPr>
+        <w:spacing w:before="120" w:after="20"/>
+      </w:pPr>
+      <w:r>
+        <w:rPr>
+          <w:rFonts w:ascii="Calibri" w:hAnsi="Calibri"/>
+          <w:b/>
+          <w:color w:val="0F172A"/>
+          <w:sz w:val="19"/>
+        </w:rPr>
+        <w:t>FinOps &amp; Compute Optimisation — DIU &amp; Capacity Tuning (TCS)</w:t>
+      </w:r>
+    </w:p>
+    <w:p>
+      <w:pPr>
+        <w:spacing w:after="20"/>
+      </w:pPr>
+      <w:r>
+        <w:rPr>
+          <w:rFonts w:ascii="Calibri" w:hAnsi="Calibri"/>
+          <w:color w:val="6B68F0"/>
+          <w:sz w:val="17"/>
+        </w:rPr>
+        <w:t>ADF · DIU Optimisation · Fabric CU Smoothing · Integration Runtime · CI/CD YAML</w:t>
+      </w:r>
+    </w:p>
+    <w:p>
+      <w:pPr>
+        <w:spacing w:after="80"/>
+      </w:pPr>
+      <w:r>
+        <w:rPr>
+          <w:rFonts w:ascii="Calibri" w:hAnsi="Calibri"/>
+          <w:color w:val="475569"/>
+          <w:sz w:val="19"/>
+        </w:rPr>
+        <w:t>Led Cloud FinOps initiative at TCS optimizing DIU allocation, cluster parallelism, and Fabric Capacity Units. Resolved Integration Runtime bottlenecks and automated CI/CD via Azure DevOps YAML, delivering a 40% reduction in data processing latency with significant measurable cost savings.</w:t>
       </w:r>
     </w:p>
     <w:p>
@@ -777,7 +881,7 @@
           <w:color w:val="6B68F0"/>
           <w:sz w:val="17"/>
         </w:rPr>
-        <w:t>Azure Data Factory · Synapse · Power BI · Aggregation Tables</w:t>
+        <w:t>Azure Data Factory · Synapse · Power BI · Aggregation Tables · PySpark</w:t>
       </w:r>
     </w:p>
     <w:p>
@@ -791,46 +895,6 @@
           <w:sz w:val="19"/>
         </w:rPr>
         <w:t>Re-engineered legacy ETL pipelines at LTIMindtree to solve the Small File Problem, cutting query execution times by 40%. Simultaneously redesigned Power BI aggregation models, improving report load speeds by 25% across all high-availability business reports.</w:t>
-      </w:r>
-    </w:p>
-    <w:p>
-      <w:pPr>
-        <w:spacing w:before="120" w:after="20"/>
-      </w:pPr>
-      <w:r>
-        <w:rPr>
-          <w:rFonts w:ascii="Calibri" w:hAnsi="Calibri"/>
-          <w:b/>
-          <w:color w:val="0F172A"/>
-          <w:sz w:val="19"/>
-        </w:rPr>
-        <w:t>FinOps &amp; Compute Optimisation — DIU Tuning (TCS)</w:t>
-      </w:r>
-    </w:p>
-    <w:p>
-      <w:pPr>
-        <w:spacing w:after="20"/>
-      </w:pPr>
-      <w:r>
-        <w:rPr>
-          <w:rFonts w:ascii="Calibri" w:hAnsi="Calibri"/>
-          <w:color w:val="6B68F0"/>
-          <w:sz w:val="17"/>
-        </w:rPr>
-        <w:t>ADF · DIU Optimisation · Integration Runtime · CI/CD YAML</w:t>
-      </w:r>
-    </w:p>
-    <w:p>
-      <w:pPr>
-        <w:spacing w:after="80"/>
-      </w:pPr>
-      <w:r>
-        <w:rPr>
-          <w:rFonts w:ascii="Calibri" w:hAnsi="Calibri"/>
-          <w:color w:val="475569"/>
-          <w:sz w:val="19"/>
-        </w:rPr>
-        <w:t>Led Cloud FinOps initiative at TCS optimising DIU allocation and parallelism across enterprise ADF pipelines. Resolved Integration Runtime bottlenecks and automated CI/CD via Azure DevOps YAML, delivering a 40% reduction in data processing latency with significant measurable cost savings.</w:t>
       </w:r>
     </w:p>
     <w:p>

</xml_diff>